<commit_message>
fix: let matched TDZ bug causing no output for 盘古+music voice input
</commit_message>
<xml_diff>
--- a/备忘.docx
+++ b/备忘.docx
@@ -45,12 +45,10 @@
     </w:p>
     <w:p/>
     <w:p>
-      <w:pPr>
+      <w:r>
         <w:rPr>
-          <w:rFonts w:hint="eastAsia"/>
+          <w:noProof/>
         </w:rPr>
-      </w:pPr>
-      <w:r>
         <w:drawing>
           <wp:inline distT="0" distB="0" distL="0" distR="0" wp14:anchorId="186C9026" wp14:editId="4CA9376D">
             <wp:extent cx="5274310" cy="2977515"/>
@@ -76,6 +74,58 @@
                     <a:xfrm>
                       <a:off x="0" y="0"/>
                       <a:ext cx="5274310" cy="2977515"/>
+                    </a:xfrm>
+                    <a:prstGeom prst="rect">
+                      <a:avLst/>
+                    </a:prstGeom>
+                  </pic:spPr>
+                </pic:pic>
+              </a:graphicData>
+            </a:graphic>
+          </wp:inline>
+        </w:drawing>
+      </w:r>
+    </w:p>
+    <w:p>
+      <w:r>
+        <w:rPr>
+          <w:rFonts w:hint="eastAsia"/>
+        </w:rPr>
+        <w:t>第二版：</w:t>
+      </w:r>
+    </w:p>
+    <w:p>
+      <w:pPr>
+        <w:rPr>
+          <w:rFonts w:hint="eastAsia"/>
+        </w:rPr>
+      </w:pPr>
+      <w:r>
+        <w:drawing>
+          <wp:inline distT="0" distB="0" distL="0" distR="0" wp14:anchorId="4E98F976" wp14:editId="3C95E7A8">
+            <wp:extent cx="5274310" cy="2336800"/>
+            <wp:effectExtent l="0" t="0" r="2540" b="6350"/>
+            <wp:docPr id="2" name="图片 2"/>
+            <wp:cNvGraphicFramePr>
+              <a:graphicFrameLocks xmlns:a="http://schemas.openxmlformats.org/drawingml/2006/main" noChangeAspect="1"/>
+            </wp:cNvGraphicFramePr>
+            <a:graphic xmlns:a="http://schemas.openxmlformats.org/drawingml/2006/main">
+              <a:graphicData uri="http://schemas.openxmlformats.org/drawingml/2006/picture">
+                <pic:pic xmlns:pic="http://schemas.openxmlformats.org/drawingml/2006/picture">
+                  <pic:nvPicPr>
+                    <pic:cNvPr id="1" name=""/>
+                    <pic:cNvPicPr/>
+                  </pic:nvPicPr>
+                  <pic:blipFill>
+                    <a:blip r:embed="rId5"/>
+                    <a:stretch>
+                      <a:fillRect/>
+                    </a:stretch>
+                  </pic:blipFill>
+                  <pic:spPr>
+                    <a:xfrm>
+                      <a:off x="0" y="0"/>
+                      <a:ext cx="5274310" cy="2336800"/>
                     </a:xfrm>
                     <a:prstGeom prst="rect">
                       <a:avLst/>

</xml_diff>